<commit_message>
Orthotimer, draagdoel en eindpunt overal rechtgezet
- Orthotimer: 100 dagen is het geheugen (ringbuffer), niet de batterij
  (Lutjeboer 2018: batterij minstens 18 maanden); elke 3 maanden uitlezen,
  vervangen waar nodig (eCRF 30 en 33). Site, MOOC, decks, REDCap, CLAUDE.md.
- Waaktijd in plaats van actieve tijd/activiteitenvenster; de 80% heet de norm
  (eCRF 17, 25b, 28, 32 en REDCap-labels, alle kopieen).
- Eén primair eindpunt (recidief), therapietrouw is de mediator: site, MOOC,
  studieprotocolpagina en meetinstrumenten.
- Decks: nulstellen één keer per sessie, geboortedatum Orthotimer 1/1/1999.
- eCRF 09: geen multi-masktool meer vermeld; F-Scan acht regio's.

Co-Authored-By: Claude Opus 5.5 <noreply@anthropic.com>
</commit_message>
<xml_diff>
--- a/(e)CRF/Per nummer/17_Script mondelinge voetzorg-educatie (SEBIA).docx
+++ b/(e)CRF/Per nummer/17_Script mondelinge voetzorg-educatie (SEBIA).docx
@@ -4210,7 +4210,7 @@
           <w:iCs/>
           <w:color w:val="123A5F"/>
         </w:rPr>
-        <w:t xml:space="preserve">“Zoals je weet hebben we een sensor in jouw zool geplaatst om te meten hoe vaak je jouw schoenen draagt. In deze figuur (fictief voorbeeld hieronder) ziet u hoe veel uur per dag u uw orthopedische schoenen hebt gedragen in de voorbije 3 maanden. De groene lijn geeft weer hoe lang u idealiter jouw schoenen zou moeten dragen: 80% van de tijd dat u wakker en actief bent. In dit voorbeeld komt dat overeen met ongeveer 16u per dag. </w:t>
+        <w:t xml:space="preserve">“Zoals je weet hebben we een sensor in jouw zool geplaatst om te meten hoe vaak je jouw schoenen draagt. In deze figuur (fictief voorbeeld hieronder) ziet u hoe veel uur per dag u uw orthopedische schoenen hebt gedragen in de voorbije 3 maanden. De groene lijn geeft weer hoe lang u idealiter jouw schoenen zou moeten dragen: 80% van de tijd dat u wakker bent. In dit voorbeeld komt dat overeen met ongeveer 16u per dag. </w:t>
       </w:r>
     </w:p>
     <w:tbl>
@@ -5912,7 +5912,7 @@
           <w:iCs/>
           <w:color w:val="24303B"/>
         </w:rPr>
-        <w:t>We hebben heel wat besproken en ik wil je alvast bedanken voor jou openheid. Ik wil nogmaals benadrukken dat het heel belangrijk is om jouw schoenen altijd te dragen en dit zowel in huis als buitenhuis bij elke stap die je zet, dus gedurende minstens 80% van de tijd dat je wakker en actief bent. Dit is nodig om zweren of wondes aan de voeten te vermijden. Via de sensor zullen we opvolgen hoe goed je hierin slaagt en de volgende keer kunnen we zeker verder bekijken hoe we jou het beste kunnen helpen om jouw schoenen zo veel mogelijk te dragen. Zijn er nog zaken die je graag nog even wil bespreken?  (</w:t>
+        <w:t>We hebben heel wat besproken en ik wil je alvast bedanken voor jou openheid. Ik wil nogmaals benadrukken dat het heel belangrijk is om jouw schoenen altijd te dragen en dit zowel in huis als buitenhuis bij elke stap die je zet, dus gedurende minstens 80% van de tijd dat je wakker bent. Dit is nodig om zweren of wondes aan de voeten te vermijden. Via de sensor zullen we opvolgen hoe goed je hierin slaagt en de volgende keer kunnen we zeker verder bekijken hoe we jou het beste kunnen helpen om jouw schoenen zo veel mogelijk te dragen. Zijn er nog zaken die je graag nog even wil bespreken?  (</w:t>
       </w:r>
       <w:r>
         <w:rPr>
@@ -6908,7 +6908,7 @@
           <w:iCs/>
           <w:color w:val="123A5F"/>
         </w:rPr>
-        <w:t>“We zien dat u daar heel wat dagen in slaagt, en dat er ook heel wat dagen zijn waarbij je kort in de buurt van dat doel (80% van uw actieve tijd) zit. Er zijn ook een aantal dagen waarop dit minder goed lukt. Hoe kijk je zelf naar deze resultaten? Wat lukt voor jou goed en wat maakt het moeilijker om de schoenen altijd te dragen en dit zowel binnen- als buitenshuis?”</w:t>
+        <w:t>“We zien dat u daar heel wat dagen in slaagt, en dat er ook heel wat dagen zijn waarbij je kort in de buurt van dat doel (80% van uw waaktijd) zit. Er zijn ook een aantal dagen waarop dit minder goed lukt. Hoe kijk je zelf naar deze resultaten? Wat lukt voor jou goed en wat maakt het moeilijker om de schoenen altijd te dragen en dit zowel binnen- als buitenshuis?”</w:t>
       </w:r>
     </w:p>
     <w:p>

</xml_diff>